<commit_message>
U(Ni 3d)=6.2 출처 확정 — MP 기본값과 MATCH, Table S1 에 Jain 2011 삽입
gabia 확인: Ni U=6.2 (F/·O/ 양쪽), O-group Co 3.32 / Mn 3.9 / Ni 6.2 / Fe 5.3.
Ni 하나가 아니라 네 값이 MP 세트 그대로라 우연 일치가 아니다.

- Table S1 `Dispersion / Hubbard U` Source: "-" -> "Ref. S3, S4"
- 참고문헌에 S4 = Jain et al., PRB 84, 045115 (2011) 삽입, UMA S4 -> S5
- open_items S 항목 닫음 (신설 당일). 남는 것: U 민감도(4 vs 6.2)는 여전히 미실시
- 방어 카드의 "뺀 것" 표를 닫힘으로 갱신

도구 수리: pymatgen 이 namespace package 라 __file__ 이 None -> YAML 폴백이 죽었다
(API 경로가 살아서 판정에는 무영향). __path__ 폴백 + importlib.metadata 버전 조회.
selftest 7/7 유지.

Co-Authored-By: Claude Opus 5 <noreply@anthropic.com>
Claude-Session: https://claude.ai/code/session_01Ggbn8y3T9cdqXF4T1tfFgL
</commit_message>
<xml_diff>
--- a/docs/manuscripts/SDCP_DFT_methods_TableS1.docx
+++ b/docs/manuscripts/SDCP_DFT_methods_TableS1.docx
@@ -1080,7 +1080,7 @@
                 <w:sz w:val="18"/>
                 <w:szCs w:val="18"/>
               </w:rPr>
-              <w:t xml:space="preserve">Ref. S3</w:t>
+              <w:t xml:space="preserve">Ref. S3, S4</w:t>
             </w:r>
           </w:p>
         </w:tc>
@@ -3201,7 +3201,7 @@
                 <w:sz w:val="18"/>
                 <w:szCs w:val="18"/>
               </w:rPr>
-              <w:t xml:space="preserve">Ref. S4</w:t>
+              <w:t xml:space="preserve">Ref. S5</w:t>
             </w:r>
           </w:p>
         </w:tc>
@@ -3508,7 +3508,22 @@
           <w:sz w:val="16"/>
           <w:szCs w:val="16"/>
         </w:rPr>
-        <w:t xml:space="preserve">[S4] B. M. Wood, M. Dzamba, X. Fu, M. Gao, M. Shuaibi, L. Barroso-Luque, K. Abdelmaqsoud, V. Gharakhanyan, J. R. Kitchin, D. S. Levine, K. Michel, A. Sriram, T. S. Cohen, A. Das, S. J. Sahoo, A. Rizvi, Z. W. Ulissi, C. L. Zitnick, UMA: A family of universal models for atoms, Adv. Neural Inf. Process. Syst. 38 (2025) 143528–143564.</w:t>
+        <w:t xml:space="preserve">[S4] A. Jain, G. Hautier, S. P. Ong, C. J. Moore, C. C. Fischer, K. A. Persson, G. Ceder, Formation enthalpies by mixing GGA and GGA+U calculations, Phys. Rev. B 84 (2011) 045115. https://doi.org/10.1103/PhysRevB.84.045115.</w:t>
+      </w:r>
+    </w:p>
+    <w:p>
+      <w:pPr>
+        <w:spacing w:after="40" w:before="0" w:line="300"/>
+      </w:pPr>
+      <w:r>
+        <w:rPr>
+          <w:rFonts w:ascii="Times New Roman" w:cs="Times New Roman" w:eastAsia="Times New Roman" w:hAnsi="Times New Roman"/>
+          <w:b w:val="false"/>
+          <w:bCs w:val="false"/>
+          <w:sz w:val="16"/>
+          <w:szCs w:val="16"/>
+        </w:rPr>
+        <w:t xml:space="preserve">[S5] B. M. Wood, M. Dzamba, X. Fu, M. Gao, M. Shuaibi, L. Barroso-Luque, K. Abdelmaqsoud, V. Gharakhanyan, J. R. Kitchin, D. S. Levine, K. Michel, A. Sriram, T. S. Cohen, A. Das, S. J. Sahoo, A. Rizvi, Z. W. Ulissi, C. L. Zitnick, UMA: A family of universal models for atoms, Adv. Neural Inf. Process. Syst. 38 (2025) 143528–143564.</w:t>
       </w:r>
     </w:p>
     <w:sectPr>

</xml_diff>